<commit_message>
docs(bhl,pentatonic): correct path-page and core-b manual claims
Co-authored-by: Cursor <cursoragent@cursor.com>
</commit_message>
<xml_diff>
--- a/docs/bhl-composer/manuals/BHL-COMPOSER-QUICK-START-V1.0.docx
+++ b/docs/bhl-composer/manuals/BHL-COMPOSER-QUICK-START-V1.0.docx
@@ -357,7 +357,7 @@
             <w:color w:val="1B4F8A"/>
             <w:u w:val="single"/>
           </w:rPr>
-          <w:t xml:space="preserve">Path-page limit</w:t>
+          <w:t xml:space="preserve">Pentatonic path page</w:t>
         </w:r>
       </w:hyperlink>
     </w:p>
@@ -2067,7 +2067,7 @@
         <w:rPr>
           <w:rFonts w:ascii="Georgia" w:hAnsi="Georgia"/>
         </w:rPr>
-        <w:t xml:space="preserve"> button in the top row opens a different page. There, only Major Pentatonic and Minor Pentatonic can be sent into path transform and phrase generation. The other eighteen collections are reference on that page. They remain real development colours inside BHL. See </w:t>
+        <w:t xml:space="preserve"> button in the top row opens a different page. Every registered colour there can be sent into path transform and phrase generation. An unknown colour is refused. The page does not substitute minor pentatonic. The same twenty colours remain development colours inside BHL. See </w:t>
       </w:r>
       <w:hyperlink w:anchor="pathlimit">
         <w:r>
@@ -2075,7 +2075,7 @@
             <w:color w:val="1B4F8A"/>
             <w:u w:val="single"/>
           </w:rPr>
-          <w:t xml:space="preserve">the path-page limit</w:t>
+          <w:t xml:space="preserve">the Pentatonic path page</w:t>
         </w:r>
       </w:hyperlink>
       <w:r>
@@ -3295,7 +3295,7 @@
         <w:rPr>
           <w:rFonts w:ascii="Georgia" w:hAnsi="Georgia"/>
         </w:rPr>
-        <w:t>Path transform on the Pentatonic page accepts only major and minor pentatonic.</w:t>
+        <w:t>An unregistered pentatonic id is refused. The Pentatonic page does not substitute minor pentatonic.</w:t>
       </w:r>
     </w:p>
     <w:p>
@@ -5193,7 +5193,7 @@
         <w:pStyle w:val="Heading2"/>
       </w:pPr>
       <w:r>
-        <w:t>Path-page limit</w:t>
+        <w:t>Pentatonic path page</w:t>
       </w:r>
       <w:bookmarkEnd w:id="22"/>
     </w:p>
@@ -5215,7 +5215,33 @@
         <w:rPr>
           <w:rFonts w:ascii="Georgia" w:hAnsi="Georgia"/>
         </w:rPr>
-        <w:t xml:space="preserve"> appears only on Major Pentatonic and Minor Pentatonic. Suspended Pentatonic and the other seventeen colours show this sentence: path transform, phrase generation, M-DEG, and M-NEAR support major and minor only. The collection is reference material. Its pitches are not sent to those operations. Inside BHL, the same collection can still colour a development.</w:t>
+        <w:t xml:space="preserve"> is on every registered collection, including Suspended Pentatonic and Hirajoshi. Minimum and maximum collection steps run from 2 to 8. A path that must return home needs at least 3 steps. Length counts collection steps, including the start. A repeated collection counts as a step. </w:t>
+      </w:r>
+      <w:r>
+        <w:rPr>
+          <w:rFonts w:ascii="Georgia" w:hAnsi="Georgia"/>
+          <w:b/>
+        </w:rPr>
+        <w:t>Save project</w:t>
+      </w:r>
+      <w:r>
+        <w:rPr>
+          <w:rFonts w:ascii="Georgia" w:hAnsi="Georgia"/>
+        </w:rPr>
+        <w:t xml:space="preserve"> stores the collection, the route, the selected candidate, the motif, the phrase, and the musical events. </w:t>
+      </w:r>
+      <w:r>
+        <w:rPr>
+          <w:rFonts w:ascii="Georgia" w:hAnsi="Georgia"/>
+          <w:b/>
+        </w:rPr>
+        <w:t>Reopen project</w:t>
+      </w:r>
+      <w:r>
+        <w:rPr>
+          <w:rFonts w:ascii="Georgia" w:hAnsi="Georgia"/>
+        </w:rPr>
+        <w:t xml:space="preserve"> loads that file. It does not generate a new path. A Pentatonic export that names a collection writes `collection id@centre` into the MusicXML. Removing that direction leaves the pitches and drops the declared name. Inside BHL, the same collection can still colour a development.</w:t>
       </w:r>
     </w:p>
     <w:p>
@@ -5269,7 +5295,7 @@
           <w:color w:val="3C424A"/>
           <w:sz w:val="18"/>
         </w:rPr>
-        <w:t>Figure 12. Pentatonic page. Major and minor can feed the path. Suspended and Open are reference only.</w:t>
+        <w:t>Figure 12. Earlier Pentatonic page. The picture shows a path button on Major only. The current page puts that button on every registered collection.</w:t>
       </w:r>
     </w:p>
     <w:p>

</xml_diff>